<commit_message>
made some content changes
</commit_message>
<xml_diff>
--- a/crochet-curio/assets/patterns/rosie-beanie-pattern-large-print-hi.docx
+++ b/crochet-curio/assets/patterns/rosie-beanie-pattern-large-print-hi.docx
@@ -198,7 +198,7 @@
       <w:r>
         <w:t xml:space="preserve">अगर इस पैटर्न में कुछ गलत है, समझ से बाहर है, या आपके स्क्रीन रीडर पर ठीक से नहीं पढ़ा जाता, तो कृपया </w:t>
       </w:r>
-      <w:hyperlink w:history="1" r:id="rId-lrqye-d4dawbf4oplch2">
+      <w:hyperlink w:history="1" r:id="rIdhyjl7ilmv33sqgyncvmlu">
         <w:r>
           <w:rPr>
             <w:rStyle w:val="Hyperlink"/>
@@ -1289,7 +1289,7 @@
         <w:spacing w:after="200"/>
       </w:pPr>
       <w:r>
-        <w:t xml:space="preserve">यह पैटर्न आपके अपने बनाने के लिए है। इससे बनी टोपियाँ बेचना चाहें तो बेच सकते हैं। बस फ़ाइल खुद आगे मत बेचिए और न ही साझा कीजिए।</w:t>
+        <w:t xml:space="preserve">यह पैटर्न आपके अपने बनाने के लिए है। फ़ाइल खुद आगे मत बेचिए और न ही साझा कीजिए।</w:t>
       </w:r>
     </w:p>
     <w:sectPr>

</xml_diff>

<commit_message>
Take the hyphens out of the Hindi patterns
A screen reader announces the hyphen, so seven of them were read aloud
as punctuation in the middle of a sentence. Each phrase is rewritten
rather than simply run together, so it still reads as a phrase:

  आगे-पीछे          -> आगे और पीछे
  साथ-साथ निशान      -> निशान साथ ही
  मार्कर साथ-साथ     -> मार्कर एक साथ
  कौन-सा            -> कौन सा
  ऊपर-नीचे          -> ऊपर से नीचे
  H-8               -> H8

The hyphen is correct Hindi orthography in the first four, and this is
a deliberate trade: the pattern is written to be listened to, and a
compound read as "साथ hyphen साथ" costs the listener more than the
spelling gains them.

Both Hindi editions are rebuilt from source: the Word file, the large
print PDF and the standard PDF. Nothing is left carrying the old text.

Co-Authored-By: Claude Opus 5 <noreply@anthropic.com>
</commit_message>
<xml_diff>
--- a/crochet-curio/assets/patterns/rosie-beanie-pattern-large-print-hi.docx
+++ b/crochet-curio/assets/patterns/rosie-beanie-pattern-large-print-hi.docx
@@ -244,7 +244,7 @@
         <w:rPr>
           <w:lang w:val="hi-IN" w:bidi="hi-IN"/>
         </w:rPr>
-        <w:t xml:space="preserve">हेडिंग क्रम से इस्तेमाल हुई हैं और सूचियाँ असली सूचियाँ हैं, इसलिए स्क्रीन रीडर हेडिंग के सहारे पैटर्न में आगे-पीछे जा सकता है।</w:t>
+        <w:t xml:space="preserve">हेडिंग क्रम से इस्तेमाल हुई हैं और सूचियाँ असली सूचियाँ हैं, इसलिए स्क्रीन रीडर हेडिंग के सहारे पैटर्न में आगे और पीछे जा सकता है।</w:t>
       </w:r>
     </w:p>
     <w:p>
@@ -308,7 +308,7 @@
         </w:rPr>
         <w:t xml:space="preserve">अगर इस पैटर्न में कुछ गलत है, समझ से बाहर है, या आपके स्क्रीन रीडर पर ठीक से नहीं पढ़ा जाता, तो कृपया </w:t>
       </w:r>
-      <w:hyperlink w:history="1" r:id="rIdaapifeebrd-1ksdb7lp0o">
+      <w:hyperlink w:history="1" r:id="rIdza9litre2luxe4bvrxohg">
         <w:r>
           <w:rPr>
             <w:rStyle w:val="Hyperlink"/>
@@ -779,7 +779,7 @@
         <w:rPr>
           <w:lang w:val="en" w:bidi="en"/>
         </w:rPr>
-        <w:t xml:space="preserve">H-8</w:t>
+        <w:t xml:space="preserve">H8</w:t>
       </w:r>
       <w:r>
         <w:rPr>
@@ -964,7 +964,7 @@
         <w:rPr>
           <w:lang w:val="hi-IN" w:bidi="hi-IN"/>
         </w:rPr>
-        <w:t xml:space="preserve">66 रो गिनना आसान रहता है अगर आप साथ-साथ निशान लगाते चलें। हर दसवीं रो की पहली स्टिच पर स्टिच मार्कर खिसकाते जाइए, या रो काउंटर इस्तेमाल कीजिए।</w:t>
+        <w:t xml:space="preserve">66 रो गिनना आसान रहता है अगर आप निशान साथ ही लगाते चलें। हर दसवीं रो की पहली स्टिच पर स्टिच मार्कर खिसकाते जाइए, या रो काउंटर इस्तेमाल कीजिए।</w:t>
       </w:r>
     </w:p>
     <w:p>
@@ -1283,7 +1283,7 @@
         <w:rPr>
           <w:lang w:val="hi-IN" w:bidi="hi-IN"/>
         </w:rPr>
-        <w:t xml:space="preserve">काम के दोनों किनारों पर हर रो की पहली स्टिच मार्क करते रहने से ही रो की आख़िरी स्टिच छूटने से बचती है। दोनों मार्कर साथ-साथ ऊपर खिसकाते जाइए।</w:t>
+        <w:t xml:space="preserve">काम के दोनों किनारों पर हर रो की पहली स्टिच मार्क करते रहने से ही रो की आख़िरी स्टिच छूटने से बचती है। दोनों मार्कर एक साथ ऊपर खिसकाते जाइए।</w:t>
       </w:r>
     </w:p>
     <w:p>
@@ -1459,7 +1459,7 @@
         <w:rPr>
           <w:lang w:val="hi-IN" w:bidi="hi-IN"/>
         </w:rPr>
-        <w:t xml:space="preserve">तय कीजिए कि कौन-सा लंबा किनारा टोपी का ऊपरी हिस्सा है। कोई भी किनारा चलेगा, क्योंकि दोनों एक जैसे हैं।</w:t>
+        <w:t xml:space="preserve">तय कीजिए कि कौन सा लंबा किनारा टोपी का ऊपरी हिस्सा है। कोई भी किनारा चलेगा, क्योंकि दोनों एक जैसे हैं।</w:t>
       </w:r>
     </w:p>
     <w:p>

</xml_diff>

<commit_message>
Write the craft terms in Devanagari, keep the Latin for the eye
Listening to the pattern, a word like "worsted" arrived in an English
voice in the middle of a Hindi sentence and was the hardest thing to
follow with the eyes shut. The terms are now written the way they are
said: वर्स्टेड, अफ़गान, एरन, एच 8.

The Latin spelling stays on the page beside each one, because that is
what a yarn band and a hook print and a reader with some sight will be
matching against. It carries aria-hidden, so the word is not said
twice, once in the wrong voice. The Word build drops those spans for
the same reason the print stylesheet drops the screen lines.

The standard Hindi edition is untouched. Its English abbreviations are
its stated premise, and it is not the edition pointed at for speech.

Co-Authored-By: Claude Opus 5 <noreply@anthropic.com>
</commit_message>
<xml_diff>
--- a/crochet-curio/assets/patterns/rosie-beanie-pattern-large-print-hi.docx
+++ b/crochet-curio/assets/patterns/rosie-beanie-pattern-large-print-hi.docx
@@ -308,7 +308,7 @@
         </w:rPr>
         <w:t xml:space="preserve">अगर इस पैटर्न में कुछ गलत है, समझ से बाहर है, या आपके स्क्रीन रीडर पर ठीक से नहीं पढ़ा जाता, तो कृपया </w:t>
       </w:r>
-      <w:hyperlink w:history="1" r:id="rIdza9litre2luxe4bvrxohg">
+      <w:hyperlink w:history="1" r:id="rIdc-zgz5oxmukbyhpddpy1d">
         <w:r>
           <w:rPr>
             <w:rStyle w:val="Hyperlink"/>
@@ -705,43 +705,7 @@
         <w:rPr>
           <w:lang w:val="hi-IN" w:bidi="hi-IN"/>
         </w:rPr>
-        <w:t xml:space="preserve">ऐक्रेलिक यार्न, 100 प्रतिशत, वेट 4 मीडियम। यह वेट </w:t>
-      </w:r>
-      <w:r>
-        <w:rPr>
-          <w:lang w:val="en" w:bidi="en"/>
-        </w:rPr>
-        <w:t xml:space="preserve">worsted</w:t>
-      </w:r>
-      <w:r>
-        <w:rPr>
-          <w:lang w:val="hi-IN" w:bidi="hi-IN"/>
-        </w:rPr>
-        <w:t xml:space="preserve">, </w:t>
-      </w:r>
-      <w:r>
-        <w:rPr>
-          <w:lang w:val="en" w:bidi="en"/>
-        </w:rPr>
-        <w:t xml:space="preserve">afghan</w:t>
-      </w:r>
-      <w:r>
-        <w:rPr>
-          <w:lang w:val="hi-IN" w:bidi="hi-IN"/>
-        </w:rPr>
-        <w:t xml:space="preserve"> या </w:t>
-      </w:r>
-      <w:r>
-        <w:rPr>
-          <w:lang w:val="en" w:bidi="en"/>
-        </w:rPr>
-        <w:t xml:space="preserve">aran</w:t>
-      </w:r>
-      <w:r>
-        <w:rPr>
-          <w:lang w:val="hi-IN" w:bidi="hi-IN"/>
-        </w:rPr>
-        <w:t xml:space="preserve"> नाम से भी बिकता है।</w:t>
+        <w:t xml:space="preserve">ऐक्रेलिक यार्न, 100 प्रतिशत, वेट 4 मीडियम। यह वेट वर्स्टेड, अफ़गान या एरन नाम से भी बिकता है।</w:t>
       </w:r>
     </w:p>
     <w:p>
@@ -773,19 +737,7 @@
         <w:rPr>
           <w:lang w:val="hi-IN" w:bidi="hi-IN"/>
         </w:rPr>
-        <w:t xml:space="preserve">क्रोशे हुक, 5 मिलीमीटर। यह साइज़ </w:t>
-      </w:r>
-      <w:r>
-        <w:rPr>
-          <w:lang w:val="en" w:bidi="en"/>
-        </w:rPr>
-        <w:t xml:space="preserve">H8</w:t>
-      </w:r>
-      <w:r>
-        <w:rPr>
-          <w:lang w:val="hi-IN" w:bidi="hi-IN"/>
-        </w:rPr>
-        <w:t xml:space="preserve"> भी लिखा जाता है।</w:t>
+        <w:t xml:space="preserve">क्रोशे हुक, 5 मिलीमीटर। यह साइज़ एच 8 भी लिखा जाता है।</w:t>
       </w:r>
     </w:p>
     <w:p>

</xml_diff>

<commit_message>
Say the Hindi editions have been tested, because now they have
The claim was written when nothing Hindi had been listened to. The web
and Word editions have now been read end to end with NVDA and a Hindi
voice, so the statement and the two notes on the product page say that
instead.

The Hindi PDF is not covered by it. Its text layer still carries
Chrome's Devanagari reordering, so the statement names it as the print
format and points a listener at the page or the Word file.

Co-Authored-By: Claude Opus 5 <noreply@anthropic.com>
</commit_message>
<xml_diff>
--- a/crochet-curio/assets/patterns/rosie-beanie-pattern-large-print-hi.docx
+++ b/crochet-curio/assets/patterns/rosie-beanie-pattern-large-print-hi.docx
@@ -229,7 +229,7 @@
         <w:rPr>
           <w:lang w:val="hi-IN" w:bidi="hi-IN"/>
         </w:rPr>
-        <w:t xml:space="preserve">स्क्रीन रीडर टेस्टिंग: इस पैटर्न के अंग्रेज़ी वेब एडिशन और अंग्रेज़ी वर्ड एडिशन, दोनों </w:t>
+        <w:t xml:space="preserve">स्क्रीन रीडर टेस्टिंग: इस पैटर्न का हिन्दी वेब एडिशन और हिन्दी वर्ड एडिशन, दोनों </w:t>
       </w:r>
       <w:r>
         <w:rPr>
@@ -241,7 +241,7 @@
         <w:rPr>
           <w:lang w:val="hi-IN" w:bidi="hi-IN"/>
         </w:rPr>
-        <w:t xml:space="preserve"> से शुरू से आख़िर तक पढ़े गए हैं और सही पढ़े गए। हिन्दी एडिशन अभी इस तरह शुरू से आख़िर तक नहीं सुने गए हैं। हिन्दी पढ़ने के लिए आपके स्क्रीन रीडर में हिन्दी आवाज़ इंस्टॉल होनी चाहिए।</w:t>
+        <w:t xml:space="preserve"> से हिन्दी आवाज़ के साथ शुरू से आख़िर तक पढ़े गए हैं और सही पढ़े गए। पढ़ने के लिए आपके स्क्रीन रीडर में हिन्दी आवाज़ इंस्टॉल होनी चाहिए। बड़े अक्षरों वाली हिन्दी PDF प्रिंट के लिए है: सुनकर पढ़ने के लिए यह वेब एडिशन या वर्ड फ़ाइल लीजिए।</w:t>
       </w:r>
     </w:p>
     <w:p>
@@ -254,7 +254,7 @@
         </w:rPr>
         <w:t xml:space="preserve">अगर इस पैटर्न में कुछ गलत है, समझ से बाहर है, या आपके स्क्रीन रीडर पर ठीक से नहीं पढ़ा जाता, तो कृपया </w:t>
       </w:r>
-      <w:hyperlink w:history="1" r:id="rId8hdwgo35cgyyqynz6umox">
+      <w:hyperlink w:history="1" r:id="rIda4xsz3rvtm9cet5qvmnpg">
         <w:r>
           <w:rPr>
             <w:rStyle w:val="Hyperlink"/>

</xml_diff>